<commit_message>
Dossiê SCEIC FSA 10/2026 versão 2, com os Anexos I, II e V
Co-Authored-By: Claude Opus 5.5 <noreply@anthropic.com>
Claude-Session: https://claude.ai/code/session_016rKCDwfWwoHYXzJRD2e2Dx
</commit_message>
<xml_diff>
--- a/base-editais/leitura-local/fichas/sceic-fsa-10-2026-longa-coproducao-dossie.docx
+++ b/base-editais/leitura-local/fichas/sceic-fsa-10-2026-longa-coproducao-dossie.docx
@@ -49,11 +49,11 @@
         <w:br/>
       </w:r>
       <w:r>
-        <w:t>Documento produzido em: 25/09/2026</w:t>
+        <w:t>Versão 2, de 25/09/2026. Substitui a versão 1, do mesmo dia</w:t>
         <w:br/>
       </w:r>
       <w:r>
-        <w:t>Base: leitura integral do edital, 31 páginas. Os Anexos I a IX não vieram no arquivo recebido</w:t>
+        <w:t>Base: leitura integral do edital (31 páginas) e dos Anexos I, II e V. Os Anexos III, IV, VI, VII, VIII e IX ainda não foram recebidos</w:t>
       </w:r>
       <w:r/>
       <w:r/>
@@ -80,6 +80,19 @@
       </w:r>
       <w:r>
         <w:t>.</w:t>
+      </w:r>
+      <w:r/>
+    </w:p>
+    <w:p>
+      <w:r/>
+      <w:r>
+        <w:rPr>
+          <w:b/>
+        </w:rPr>
+        <w:t>O que mudou na versão 2.</w:t>
+      </w:r>
+      <w:r>
+        <w:t xml:space="preserve"> A leitura do Anexo V trouxe exigências de contratação que não aparecem no edital: o projeto precisa estar aprovado para captação na ANCINE (ou pedir a aprovação em até 30 dias depois do resultado), ter distribuidora ou canal de TV como parceiro formal e concluir a obra em 24 meses (36 no caso de longa de animação). Também ficou claro como o FSA recebe o retorno. Os Anexos I e II confirmaram os documentos da política afirmativa. As mudanças estão nas partes 0, 4, 5, 6, 8, 9, 13 e 14.</w:t>
       </w:r>
       <w:r/>
     </w:p>
@@ -362,13 +375,133 @@
               <w:rPr>
                 <w:sz w:val="18"/>
               </w:rPr>
-              <w:t>Incompleto.</w:t>
-            </w:r>
-            <w:r>
-              <w:rPr>
-                <w:sz w:val="18"/>
-              </w:rPr>
-              <w:t xml:space="preserve"> Os Anexos I a IX não estavam no PDF. Três deles são modelos obrigatórios da inscrição e da habilitação (I, II e IX)</w:t>
+              <w:t>Parcial.</w:t>
+            </w:r>
+            <w:r>
+              <w:rPr>
+                <w:sz w:val="18"/>
+              </w:rPr>
+              <w:t xml:space="preserve"> Lidos: I, II e V. Faltam: III (lista de cidades da Film Commission), IV, VI, VII, VIII e IX. O IX é obrigatório na habilitação</w:t>
+            </w:r>
+          </w:p>
+        </w:tc>
+      </w:tr>
+      <w:tr>
+        <w:tc>
+          <w:tcPr>
+            <w:tcW w:type="dxa" w:w="4933"/>
+          </w:tcPr>
+          <w:p>
+            <w:pPr>
+              <w:spacing w:after="0"/>
+            </w:pPr>
+            <w:r>
+              <w:rPr>
+                <w:sz w:val="18"/>
+              </w:rPr>
+              <w:t>Aprovação na ANCINE</w:t>
+            </w:r>
+          </w:p>
+        </w:tc>
+        <w:tc>
+          <w:tcPr>
+            <w:tcW w:type="dxa" w:w="4933"/>
+          </w:tcPr>
+          <w:p>
+            <w:pPr>
+              <w:spacing w:after="0"/>
+            </w:pPr>
+            <w:r>
+              <w:rPr>
+                <w:sz w:val="18"/>
+              </w:rPr>
+              <w:t xml:space="preserve">Para contratar, o projeto precisa estar </w:t>
+            </w:r>
+            <w:r>
+              <w:rPr>
+                <w:b/>
+                <w:sz w:val="18"/>
+              </w:rPr>
+              <w:t>aprovado para captação na ANCINE</w:t>
+            </w:r>
+            <w:r>
+              <w:rPr>
+                <w:sz w:val="18"/>
+              </w:rPr>
+              <w:t xml:space="preserve"> . Se ainda não estiver, a produtora tem </w:t>
+            </w:r>
+            <w:r>
+              <w:rPr>
+                <w:b/>
+                <w:sz w:val="18"/>
+              </w:rPr>
+              <w:t>30 dias corridos</w:t>
+            </w:r>
+            <w:r>
+              <w:rPr>
+                <w:sz w:val="18"/>
+              </w:rPr>
+              <w:t xml:space="preserve"> depois do resultado final para pedir, sob pena de cancelamento (Anexo V, 5.1 e 5.3)</w:t>
+            </w:r>
+          </w:p>
+        </w:tc>
+      </w:tr>
+      <w:tr>
+        <w:tc>
+          <w:tcPr>
+            <w:tcW w:type="dxa" w:w="4933"/>
+          </w:tcPr>
+          <w:p>
+            <w:pPr>
+              <w:spacing w:after="0"/>
+            </w:pPr>
+            <w:r>
+              <w:rPr>
+                <w:sz w:val="18"/>
+              </w:rPr>
+              <w:t>Parceiro de mercado</w:t>
+            </w:r>
+          </w:p>
+        </w:tc>
+        <w:tc>
+          <w:tcPr>
+            <w:tcW w:type="dxa" w:w="4933"/>
+          </w:tcPr>
+          <w:p>
+            <w:pPr>
+              <w:spacing w:after="0"/>
+            </w:pPr>
+            <w:r>
+              <w:rPr>
+                <w:sz w:val="18"/>
+              </w:rPr>
+              <w:t xml:space="preserve">Filme para cinema precisa de </w:t>
+            </w:r>
+            <w:r>
+              <w:rPr>
+                <w:b/>
+                <w:sz w:val="18"/>
+              </w:rPr>
+              <w:t>distribuidora</w:t>
+            </w:r>
+            <w:r>
+              <w:rPr>
+                <w:sz w:val="18"/>
+              </w:rPr>
+              <w:t xml:space="preserve"> registrada na ANCINE (ou distribuição própria). Obra para TV ou streaming precisa de </w:t>
+            </w:r>
+            <w:r>
+              <w:rPr>
+                <w:b/>
+                <w:sz w:val="18"/>
+              </w:rPr>
+              <w:t>canal de TV</w:t>
+            </w:r>
+            <w:r>
+              <w:rPr>
+                <w:sz w:val="18"/>
+              </w:rPr>
+              <w:t xml:space="preserve"> com contrato de licenciamento (Anexo V, 4.2 a 4.4)</w:t>
             </w:r>
           </w:p>
         </w:tc>
@@ -2912,7 +3045,7 @@
               <w:rPr>
                 <w:sz w:val="18"/>
               </w:rPr>
-              <w:t>Participação do FSA nas receitas da obra. Regras no Anexo V (a completar com o anexo)</w:t>
+              <w:t>O FSA recebe uma parte da receita líquida da produtora por 7 anos depois da primeira exibição comercial. A parte é metade da participação do FSA no orçamento financiável. Exemplo: se o FSA pagou 40% dos itens financiáveis, recebe 20% da receita líquida da produtora</w:t>
             </w:r>
           </w:p>
         </w:tc>
@@ -2928,7 +3061,7 @@
               <w:rPr>
                 <w:sz w:val="18"/>
               </w:rPr>
-              <w:t>2.1 d e 16.4</w:t>
+              <w:t>Anexo V, 10.1 e 10.2</w:t>
             </w:r>
           </w:p>
         </w:tc>
@@ -2946,7 +3079,7 @@
               <w:rPr>
                 <w:sz w:val="18"/>
               </w:rPr>
-              <w:t>Contrapartida financeira</w:t>
+              <w:t>Retorno sobre marcas e adaptações</w:t>
             </w:r>
           </w:p>
         </w:tc>
@@ -2962,7 +3095,7 @@
               <w:rPr>
                 <w:sz w:val="18"/>
               </w:rPr>
-              <w:t>Não encontrado</w:t>
+              <w:t>Também metade da participação do FSA. Sobre obras derivadas (continuação, série a partir do filme), 2% da receita líquida, salvo se o FSA investir nelas</w:t>
             </w:r>
           </w:p>
         </w:tc>
@@ -2978,7 +3111,7 @@
               <w:rPr>
                 <w:sz w:val="18"/>
               </w:rPr>
-              <w:t xml:space="preserve"> </w:t>
+              <w:t>Anexo V, 10.3, 10.5 e 10.6</w:t>
             </w:r>
           </w:p>
         </w:tc>
@@ -2996,6 +3129,206 @@
               <w:rPr>
                 <w:sz w:val="18"/>
               </w:rPr>
+              <w:t>Coprodução internacional</w:t>
+            </w:r>
+          </w:p>
+        </w:tc>
+        <w:tc>
+          <w:tcPr>
+            <w:tcW w:type="dxa" w:w="3289"/>
+          </w:tcPr>
+          <w:p>
+            <w:pPr>
+              <w:spacing w:after="0"/>
+            </w:pPr>
+            <w:r>
+              <w:rPr>
+                <w:sz w:val="18"/>
+              </w:rPr>
+              <w:t>O retorno é calculado só sobre a parte brasileira, em todos os territórios</w:t>
+            </w:r>
+          </w:p>
+        </w:tc>
+        <w:tc>
+          <w:tcPr>
+            <w:tcW w:type="dxa" w:w="3289"/>
+          </w:tcPr>
+          <w:p>
+            <w:pPr>
+              <w:spacing w:after="0"/>
+            </w:pPr>
+            <w:r>
+              <w:rPr>
+                <w:sz w:val="18"/>
+              </w:rPr>
+              <w:t>Anexo V, 10.8 e 10.9</w:t>
+            </w:r>
+          </w:p>
+        </w:tc>
+      </w:tr>
+      <w:tr>
+        <w:tc>
+          <w:tcPr>
+            <w:tcW w:type="dxa" w:w="3289"/>
+          </w:tcPr>
+          <w:p>
+            <w:pPr>
+              <w:spacing w:after="0"/>
+            </w:pPr>
+            <w:r>
+              <w:rPr>
+                <w:sz w:val="18"/>
+              </w:rPr>
+              <w:t>Período das despesas aceitas</w:t>
+            </w:r>
+          </w:p>
+        </w:tc>
+        <w:tc>
+          <w:tcPr>
+            <w:tcW w:type="dxa" w:w="3289"/>
+          </w:tcPr>
+          <w:p>
+            <w:pPr>
+              <w:spacing w:after="0"/>
+            </w:pPr>
+            <w:r>
+              <w:rPr>
+                <w:sz w:val="18"/>
+              </w:rPr>
+              <w:t>Da publicação da aprovação para captação no Diário Oficial da União até 180 dias depois da conclusão da obra ou do desembolso do FSA, o que vier por último</w:t>
+            </w:r>
+          </w:p>
+        </w:tc>
+        <w:tc>
+          <w:tcPr>
+            <w:tcW w:type="dxa" w:w="3289"/>
+          </w:tcPr>
+          <w:p>
+            <w:pPr>
+              <w:spacing w:after="0"/>
+            </w:pPr>
+            <w:r>
+              <w:rPr>
+                <w:sz w:val="18"/>
+              </w:rPr>
+              <w:t>Anexo V, 9.2</w:t>
+            </w:r>
+          </w:p>
+        </w:tc>
+      </w:tr>
+      <w:tr>
+        <w:tc>
+          <w:tcPr>
+            <w:tcW w:type="dxa" w:w="3289"/>
+          </w:tcPr>
+          <w:p>
+            <w:pPr>
+              <w:spacing w:after="0"/>
+            </w:pPr>
+            <w:r>
+              <w:rPr>
+                <w:sz w:val="18"/>
+              </w:rPr>
+              <w:t>Prazo para concluir a obra</w:t>
+            </w:r>
+          </w:p>
+        </w:tc>
+        <w:tc>
+          <w:tcPr>
+            <w:tcW w:type="dxa" w:w="3289"/>
+          </w:tcPr>
+          <w:p>
+            <w:pPr>
+              <w:spacing w:after="0"/>
+            </w:pPr>
+            <w:r>
+              <w:rPr>
+                <w:sz w:val="18"/>
+              </w:rPr>
+              <w:t>24 meses a partir da primeira liberação do recurso. Longa de animação: 36 meses</w:t>
+            </w:r>
+          </w:p>
+        </w:tc>
+        <w:tc>
+          <w:tcPr>
+            <w:tcW w:type="dxa" w:w="3289"/>
+          </w:tcPr>
+          <w:p>
+            <w:pPr>
+              <w:spacing w:after="0"/>
+            </w:pPr>
+            <w:r>
+              <w:rPr>
+                <w:sz w:val="18"/>
+              </w:rPr>
+              <w:t>Anexo V, 8.2</w:t>
+            </w:r>
+          </w:p>
+        </w:tc>
+      </w:tr>
+      <w:tr>
+        <w:tc>
+          <w:tcPr>
+            <w:tcW w:type="dxa" w:w="3289"/>
+          </w:tcPr>
+          <w:p>
+            <w:pPr>
+              <w:spacing w:after="0"/>
+            </w:pPr>
+            <w:r>
+              <w:rPr>
+                <w:sz w:val="18"/>
+              </w:rPr>
+              <w:t>Contrapartida financeira</w:t>
+            </w:r>
+          </w:p>
+        </w:tc>
+        <w:tc>
+          <w:tcPr>
+            <w:tcW w:type="dxa" w:w="3289"/>
+          </w:tcPr>
+          <w:p>
+            <w:pPr>
+              <w:spacing w:after="0"/>
+            </w:pPr>
+            <w:r>
+              <w:rPr>
+                <w:sz w:val="18"/>
+              </w:rPr>
+              <w:t>Não encontrado</w:t>
+            </w:r>
+          </w:p>
+        </w:tc>
+        <w:tc>
+          <w:tcPr>
+            <w:tcW w:type="dxa" w:w="3289"/>
+          </w:tcPr>
+          <w:p>
+            <w:pPr>
+              <w:spacing w:after="0"/>
+            </w:pPr>
+            <w:r>
+              <w:rPr>
+                <w:sz w:val="18"/>
+              </w:rPr>
+              <w:t xml:space="preserve"> </w:t>
+            </w:r>
+          </w:p>
+        </w:tc>
+      </w:tr>
+      <w:tr>
+        <w:tc>
+          <w:tcPr>
+            <w:tcW w:type="dxa" w:w="3289"/>
+          </w:tcPr>
+          <w:p>
+            <w:pPr>
+              <w:spacing w:after="0"/>
+            </w:pPr>
+            <w:r>
+              <w:rPr>
+                <w:sz w:val="18"/>
+              </w:rPr>
               <w:t>Três cotações</w:t>
             </w:r>
           </w:p>
@@ -3012,7 +3345,7 @@
               <w:rPr>
                 <w:sz w:val="18"/>
               </w:rPr>
-              <w:t>Não encontrado no edital. Pode constar das IN ANCINE ou do Anexo V</w:t>
+              <w:t>Não encontrado no edital nem no Anexo V. Segue a IN ANCINE 158</w:t>
             </w:r>
           </w:p>
         </w:tc>
@@ -3029,6 +3362,56 @@
                 <w:sz w:val="18"/>
               </w:rPr>
               <w:t xml:space="preserve"> </w:t>
+            </w:r>
+          </w:p>
+        </w:tc>
+      </w:tr>
+      <w:tr>
+        <w:tc>
+          <w:tcPr>
+            <w:tcW w:type="dxa" w:w="3289"/>
+          </w:tcPr>
+          <w:p>
+            <w:pPr>
+              <w:spacing w:after="0"/>
+            </w:pPr>
+            <w:r>
+              <w:rPr>
+                <w:sz w:val="18"/>
+              </w:rPr>
+              <w:t>Licença mínima para TV e streaming</w:t>
+            </w:r>
+          </w:p>
+        </w:tc>
+        <w:tc>
+          <w:tcPr>
+            <w:tcW w:type="dxa" w:w="3289"/>
+          </w:tcPr>
+          <w:p>
+            <w:pPr>
+              <w:spacing w:after="0"/>
+            </w:pPr>
+            <w:r>
+              <w:rPr>
+                <w:sz w:val="18"/>
+              </w:rPr>
+              <w:t>O canal paga pela licença pelo menos 15% dos itens financiáveis, e nunca menos de R$ 15.000,00. A licença dura no máximo 24 meses. Há reduções para canais comunitários, universitários, estatais, educativos, independentes, de fora do eixo Sudeste ou sem exclusividade</w:t>
+            </w:r>
+          </w:p>
+        </w:tc>
+        <w:tc>
+          <w:tcPr>
+            <w:tcW w:type="dxa" w:w="3289"/>
+          </w:tcPr>
+          <w:p>
+            <w:pPr>
+              <w:spacing w:after="0"/>
+            </w:pPr>
+            <w:r>
+              <w:rPr>
+                <w:sz w:val="18"/>
+              </w:rPr>
+              <w:t>Anexo V, 11.5 a 11.12</w:t>
             </w:r>
           </w:p>
         </w:tc>
@@ -3135,7 +3518,7 @@
         <w:t>R$ 2.500.000,00</w:t>
       </w:r>
       <w:r>
-        <w:t>. Numa coprodução internacional o orçamento costuma passar disso, então a parte estrangeira e outras fontes entram na conta. Confirmar no Anexo V se os 80% valem sobre o orçamento total da obra ou só sobre a parte brasileira.</w:t>
+        <w:t>. Numa coprodução internacional o orçamento costuma passar disso, então a parte estrangeira e outras fontes entram na conta. O Anexo V fala em "orçamento total do projeto, nos termos da IN ANCINE 158" (5.8 VI). Como o projeto aprovado na ANCINE é o da parte brasileira, é provável que a base seja o orçamento brasileiro. Confirmar com o canal oficial (divergência D3).</w:t>
       </w:r>
       <w:r/>
       <w:r/>
@@ -7548,7 +7931,20 @@
               <w:rPr>
                 <w:sz w:val="18"/>
               </w:rPr>
-              <w:t>Documentos que comprovam a condição declarada na política afirmativa</w:t>
+              <w:t xml:space="preserve">Documentos da política afirmativa, em PDF, de </w:t>
+            </w:r>
+            <w:r>
+              <w:rPr>
+                <w:b/>
+                <w:sz w:val="18"/>
+              </w:rPr>
+              <w:t>todas as pessoas listadas no Anexo I</w:t>
+            </w:r>
+            <w:r>
+              <w:rPr>
+                <w:sz w:val="18"/>
+              </w:rPr>
+              <w:t xml:space="preserve"> : documento com foto de cada uma (inclusive de quem não entra nos 30%); RANI ou documento civil com pertencimento étnico, no caso de pessoa indígena; laudo médico com espécie e grau da deficiência, no caso de pessoa com deficiência</w:t>
             </w:r>
           </w:p>
         </w:tc>
@@ -7564,7 +7960,7 @@
               <w:rPr>
                 <w:sz w:val="18"/>
               </w:rPr>
-              <w:t>Conforme Anexo I</w:t>
+              <w:t>Anexo I, instruções</w:t>
             </w:r>
           </w:p>
         </w:tc>
@@ -7985,7 +8381,7 @@
               <w:rPr>
                 <w:sz w:val="18"/>
               </w:rPr>
-              <w:t>Condições do Anexo V para contratação (a completar com o anexo)</w:t>
+              <w:t>Projeto aprovado para captação na ANCINE, com o mesmo objeto. Se ainda não estiver, pedir em até 30 dias corridos depois do resultado final</w:t>
             </w:r>
           </w:p>
         </w:tc>
@@ -8001,7 +8397,7 @@
               <w:rPr>
                 <w:sz w:val="18"/>
               </w:rPr>
-              <w:t>16.4 e 16.6</w:t>
+              <w:t>Anexo V, 5.1 e 5.3</w:t>
             </w:r>
           </w:p>
         </w:tc>
@@ -8051,7 +8447,7 @@
               <w:rPr>
                 <w:sz w:val="18"/>
               </w:rPr>
-              <w:t>Assinatura do contrato de investimento (Anexo VI, VII ou VIII, conforme o caso)</w:t>
+              <w:t>Cumprir o Regulamento para Contratação de Projetos do FSA em até 120 dias corridos, contados do resultado final ou da aprovação na ANCINE, o que vier por último. O prazo não é prorrogável</w:t>
             </w:r>
           </w:p>
         </w:tc>
@@ -8067,7 +8463,535 @@
               <w:rPr>
                 <w:sz w:val="18"/>
               </w:rPr>
-              <w:t>16.7</w:t>
+              <w:t>Anexo V, 5.4</w:t>
+            </w:r>
+          </w:p>
+        </w:tc>
+        <w:tc>
+          <w:tcPr>
+            <w:tcW w:type="dxa" w:w="2466"/>
+          </w:tcPr>
+          <w:p>
+            <w:pPr>
+              <w:spacing w:after="0"/>
+            </w:pPr>
+            <w:r>
+              <w:rPr>
+                <w:sz w:val="18"/>
+              </w:rPr>
+              <w:t>☐</w:t>
+            </w:r>
+          </w:p>
+        </w:tc>
+      </w:tr>
+      <w:tr>
+        <w:tc>
+          <w:tcPr>
+            <w:tcW w:type="dxa" w:w="2466"/>
+          </w:tcPr>
+          <w:p>
+            <w:pPr>
+              <w:spacing w:after="0"/>
+            </w:pPr>
+            <w:r>
+              <w:rPr>
+                <w:sz w:val="18"/>
+              </w:rPr>
+              <w:t>49</w:t>
+            </w:r>
+          </w:p>
+        </w:tc>
+        <w:tc>
+          <w:tcPr>
+            <w:tcW w:type="dxa" w:w="2466"/>
+          </w:tcPr>
+          <w:p>
+            <w:pPr>
+              <w:spacing w:after="0"/>
+            </w:pPr>
+            <w:r>
+              <w:rPr>
+                <w:sz w:val="18"/>
+              </w:rPr>
+              <w:t>Cinema: contrato de distribuição com distribuidora registrada na ANCINE (CNAE 5913-8/00), com segmentos, territórios, prazos e remuneração, incluindo salas de cinema no Brasil. Ou declaração de distribuição própria</w:t>
+            </w:r>
+          </w:p>
+        </w:tc>
+        <w:tc>
+          <w:tcPr>
+            <w:tcW w:type="dxa" w:w="2466"/>
+          </w:tcPr>
+          <w:p>
+            <w:pPr>
+              <w:spacing w:after="0"/>
+            </w:pPr>
+            <w:r>
+              <w:rPr>
+                <w:sz w:val="18"/>
+              </w:rPr>
+              <w:t>Anexo V, 4.2 a, 4.3 e 5.8 I</w:t>
+            </w:r>
+          </w:p>
+        </w:tc>
+        <w:tc>
+          <w:tcPr>
+            <w:tcW w:type="dxa" w:w="2466"/>
+          </w:tcPr>
+          <w:p>
+            <w:pPr>
+              <w:spacing w:after="0"/>
+            </w:pPr>
+            <w:r>
+              <w:rPr>
+                <w:sz w:val="18"/>
+              </w:rPr>
+              <w:t>☐</w:t>
+            </w:r>
+          </w:p>
+        </w:tc>
+      </w:tr>
+      <w:tr>
+        <w:tc>
+          <w:tcPr>
+            <w:tcW w:type="dxa" w:w="2466"/>
+          </w:tcPr>
+          <w:p>
+            <w:pPr>
+              <w:spacing w:after="0"/>
+            </w:pPr>
+            <w:r>
+              <w:rPr>
+                <w:sz w:val="18"/>
+              </w:rPr>
+              <w:t>50</w:t>
+            </w:r>
+          </w:p>
+        </w:tc>
+        <w:tc>
+          <w:tcPr>
+            <w:tcW w:type="dxa" w:w="2466"/>
+          </w:tcPr>
+          <w:p>
+            <w:pPr>
+              <w:spacing w:after="0"/>
+            </w:pPr>
+            <w:r>
+              <w:rPr>
+                <w:sz w:val="18"/>
+              </w:rPr>
+              <w:t>TV ou streaming: contrato de licenciamento obrigatório com canal de TV registrado na ANCINE, com a primeira exibição e licença mínima de 15% dos itens financiáveis</w:t>
+            </w:r>
+          </w:p>
+        </w:tc>
+        <w:tc>
+          <w:tcPr>
+            <w:tcW w:type="dxa" w:w="2466"/>
+          </w:tcPr>
+          <w:p>
+            <w:pPr>
+              <w:spacing w:after="0"/>
+            </w:pPr>
+            <w:r>
+              <w:rPr>
+                <w:sz w:val="18"/>
+              </w:rPr>
+              <w:t>Anexo V, 4.4 e 11</w:t>
+            </w:r>
+          </w:p>
+        </w:tc>
+        <w:tc>
+          <w:tcPr>
+            <w:tcW w:type="dxa" w:w="2466"/>
+          </w:tcPr>
+          <w:p>
+            <w:pPr>
+              <w:spacing w:after="0"/>
+            </w:pPr>
+            <w:r>
+              <w:rPr>
+                <w:sz w:val="18"/>
+              </w:rPr>
+              <w:t>☐</w:t>
+            </w:r>
+          </w:p>
+        </w:tc>
+      </w:tr>
+      <w:tr>
+        <w:tc>
+          <w:tcPr>
+            <w:tcW w:type="dxa" w:w="2466"/>
+          </w:tcPr>
+          <w:p>
+            <w:pPr>
+              <w:spacing w:after="0"/>
+            </w:pPr>
+            <w:r>
+              <w:rPr>
+                <w:sz w:val="18"/>
+              </w:rPr>
+              <w:t>51</w:t>
+            </w:r>
+          </w:p>
+        </w:tc>
+        <w:tc>
+          <w:tcPr>
+            <w:tcW w:type="dxa" w:w="2466"/>
+          </w:tcPr>
+          <w:p>
+            <w:pPr>
+              <w:spacing w:after="0"/>
+            </w:pPr>
+            <w:r>
+              <w:rPr>
+                <w:sz w:val="18"/>
+              </w:rPr>
+              <w:t>Coprodução nacional: a proponente com a maior parte dos direitos entre as coprodutoras brasileiras</w:t>
+            </w:r>
+          </w:p>
+        </w:tc>
+        <w:tc>
+          <w:tcPr>
+            <w:tcW w:type="dxa" w:w="2466"/>
+          </w:tcPr>
+          <w:p>
+            <w:pPr>
+              <w:spacing w:after="0"/>
+            </w:pPr>
+            <w:r>
+              <w:rPr>
+                <w:sz w:val="18"/>
+              </w:rPr>
+              <w:t>Anexo V, 5.8 III</w:t>
+            </w:r>
+          </w:p>
+        </w:tc>
+        <w:tc>
+          <w:tcPr>
+            <w:tcW w:type="dxa" w:w="2466"/>
+          </w:tcPr>
+          <w:p>
+            <w:pPr>
+              <w:spacing w:after="0"/>
+            </w:pPr>
+            <w:r>
+              <w:rPr>
+                <w:sz w:val="18"/>
+              </w:rPr>
+              <w:t>☐</w:t>
+            </w:r>
+          </w:p>
+        </w:tc>
+      </w:tr>
+      <w:tr>
+        <w:tc>
+          <w:tcPr>
+            <w:tcW w:type="dxa" w:w="2466"/>
+          </w:tcPr>
+          <w:p>
+            <w:pPr>
+              <w:spacing w:after="0"/>
+            </w:pPr>
+            <w:r>
+              <w:rPr>
+                <w:sz w:val="18"/>
+              </w:rPr>
+              <w:t>52</w:t>
+            </w:r>
+          </w:p>
+        </w:tc>
+        <w:tc>
+          <w:tcPr>
+            <w:tcW w:type="dxa" w:w="2466"/>
+          </w:tcPr>
+          <w:p>
+            <w:pPr>
+              <w:spacing w:after="0"/>
+            </w:pPr>
+            <w:r>
+              <w:rPr>
+                <w:sz w:val="18"/>
+              </w:rPr>
+              <w:t>Obra sem CPB emitido até o resultado final e sem nenhum direito cedido de graça</w:t>
+            </w:r>
+          </w:p>
+        </w:tc>
+        <w:tc>
+          <w:tcPr>
+            <w:tcW w:type="dxa" w:w="2466"/>
+          </w:tcPr>
+          <w:p>
+            <w:pPr>
+              <w:spacing w:after="0"/>
+            </w:pPr>
+            <w:r>
+              <w:rPr>
+                <w:sz w:val="18"/>
+              </w:rPr>
+              <w:t>Anexo V, 5.8 VII e VIII</w:t>
+            </w:r>
+          </w:p>
+        </w:tc>
+        <w:tc>
+          <w:tcPr>
+            <w:tcW w:type="dxa" w:w="2466"/>
+          </w:tcPr>
+          <w:p>
+            <w:pPr>
+              <w:spacing w:after="0"/>
+            </w:pPr>
+            <w:r>
+              <w:rPr>
+                <w:sz w:val="18"/>
+              </w:rPr>
+              <w:t>☐</w:t>
+            </w:r>
+          </w:p>
+        </w:tc>
+      </w:tr>
+      <w:tr>
+        <w:tc>
+          <w:tcPr>
+            <w:tcW w:type="dxa" w:w="2466"/>
+          </w:tcPr>
+          <w:p>
+            <w:pPr>
+              <w:spacing w:after="0"/>
+            </w:pPr>
+            <w:r>
+              <w:rPr>
+                <w:sz w:val="18"/>
+              </w:rPr>
+              <w:t>53</w:t>
+            </w:r>
+          </w:p>
+        </w:tc>
+        <w:tc>
+          <w:tcPr>
+            <w:tcW w:type="dxa" w:w="2466"/>
+          </w:tcPr>
+          <w:p>
+            <w:pPr>
+              <w:spacing w:after="0"/>
+            </w:pPr>
+            <w:r>
+              <w:rPr>
+                <w:sz w:val="18"/>
+              </w:rPr>
+              <w:t>Projeto não selecionado em outra chamada do FSA que proíba aportes adicionais</w:t>
+            </w:r>
+          </w:p>
+        </w:tc>
+        <w:tc>
+          <w:tcPr>
+            <w:tcW w:type="dxa" w:w="2466"/>
+          </w:tcPr>
+          <w:p>
+            <w:pPr>
+              <w:spacing w:after="0"/>
+            </w:pPr>
+            <w:r>
+              <w:rPr>
+                <w:sz w:val="18"/>
+              </w:rPr>
+              <w:t>Anexo V, 5.8 IX</w:t>
+            </w:r>
+          </w:p>
+        </w:tc>
+        <w:tc>
+          <w:tcPr>
+            <w:tcW w:type="dxa" w:w="2466"/>
+          </w:tcPr>
+          <w:p>
+            <w:pPr>
+              <w:spacing w:after="0"/>
+            </w:pPr>
+            <w:r>
+              <w:rPr>
+                <w:sz w:val="18"/>
+              </w:rPr>
+              <w:t>☐</w:t>
+            </w:r>
+          </w:p>
+        </w:tc>
+      </w:tr>
+      <w:tr>
+        <w:tc>
+          <w:tcPr>
+            <w:tcW w:type="dxa" w:w="2466"/>
+          </w:tcPr>
+          <w:p>
+            <w:pPr>
+              <w:spacing w:after="0"/>
+            </w:pPr>
+            <w:r>
+              <w:rPr>
+                <w:sz w:val="18"/>
+              </w:rPr>
+              <w:t>54</w:t>
+            </w:r>
+          </w:p>
+        </w:tc>
+        <w:tc>
+          <w:tcPr>
+            <w:tcW w:type="dxa" w:w="2466"/>
+          </w:tcPr>
+          <w:p>
+            <w:pPr>
+              <w:spacing w:after="0"/>
+            </w:pPr>
+            <w:r>
+              <w:rPr>
+                <w:sz w:val="18"/>
+              </w:rPr>
+              <w:t>Produtora, distribuidora e canal de TV em dia com a ANCINE e o FSA e sem pendência na Receita, no FGTS, na Justiça do Trabalho, no CEIS, no cadastro de improbidade e no CADIN federal</w:t>
+            </w:r>
+          </w:p>
+        </w:tc>
+        <w:tc>
+          <w:tcPr>
+            <w:tcW w:type="dxa" w:w="2466"/>
+          </w:tcPr>
+          <w:p>
+            <w:pPr>
+              <w:spacing w:after="0"/>
+            </w:pPr>
+            <w:r>
+              <w:rPr>
+                <w:sz w:val="18"/>
+              </w:rPr>
+              <w:t>Anexo V, 7.1</w:t>
+            </w:r>
+          </w:p>
+        </w:tc>
+        <w:tc>
+          <w:tcPr>
+            <w:tcW w:type="dxa" w:w="2466"/>
+          </w:tcPr>
+          <w:p>
+            <w:pPr>
+              <w:spacing w:after="0"/>
+            </w:pPr>
+            <w:r>
+              <w:rPr>
+                <w:sz w:val="18"/>
+              </w:rPr>
+              <w:t>☐</w:t>
+            </w:r>
+          </w:p>
+        </w:tc>
+      </w:tr>
+      <w:tr>
+        <w:tc>
+          <w:tcPr>
+            <w:tcW w:type="dxa" w:w="2466"/>
+          </w:tcPr>
+          <w:p>
+            <w:pPr>
+              <w:spacing w:after="0"/>
+            </w:pPr>
+            <w:r>
+              <w:rPr>
+                <w:sz w:val="18"/>
+              </w:rPr>
+              <w:t>55</w:t>
+            </w:r>
+          </w:p>
+        </w:tc>
+        <w:tc>
+          <w:tcPr>
+            <w:tcW w:type="dxa" w:w="2466"/>
+          </w:tcPr>
+          <w:p>
+            <w:pPr>
+              <w:spacing w:after="0"/>
+            </w:pPr>
+            <w:r>
+              <w:rPr>
+                <w:sz w:val="18"/>
+              </w:rPr>
+              <w:t>Documentos em língua estrangeira acompanhados de tradução simples</w:t>
+            </w:r>
+          </w:p>
+        </w:tc>
+        <w:tc>
+          <w:tcPr>
+            <w:tcW w:type="dxa" w:w="2466"/>
+          </w:tcPr>
+          <w:p>
+            <w:pPr>
+              <w:spacing w:after="0"/>
+            </w:pPr>
+            <w:r>
+              <w:rPr>
+                <w:sz w:val="18"/>
+              </w:rPr>
+              <w:t>Anexo V, 5.9.1</w:t>
+            </w:r>
+          </w:p>
+        </w:tc>
+        <w:tc>
+          <w:tcPr>
+            <w:tcW w:type="dxa" w:w="2466"/>
+          </w:tcPr>
+          <w:p>
+            <w:pPr>
+              <w:spacing w:after="0"/>
+            </w:pPr>
+            <w:r>
+              <w:rPr>
+                <w:sz w:val="18"/>
+              </w:rPr>
+              <w:t>☐</w:t>
+            </w:r>
+          </w:p>
+        </w:tc>
+      </w:tr>
+      <w:tr>
+        <w:tc>
+          <w:tcPr>
+            <w:tcW w:type="dxa" w:w="2466"/>
+          </w:tcPr>
+          <w:p>
+            <w:pPr>
+              <w:spacing w:after="0"/>
+            </w:pPr>
+            <w:r>
+              <w:rPr>
+                <w:sz w:val="18"/>
+              </w:rPr>
+              <w:t>56</w:t>
+            </w:r>
+          </w:p>
+        </w:tc>
+        <w:tc>
+          <w:tcPr>
+            <w:tcW w:type="dxa" w:w="2466"/>
+          </w:tcPr>
+          <w:p>
+            <w:pPr>
+              <w:spacing w:after="0"/>
+            </w:pPr>
+            <w:r>
+              <w:rPr>
+                <w:sz w:val="18"/>
+              </w:rPr>
+              <w:t>Assinatura do contrato de investimento (Anexo VI, VII ou VIII, conforme o caso) e do Termo de Compromisso com a SCEIC (Anexo IX)</w:t>
+            </w:r>
+          </w:p>
+        </w:tc>
+        <w:tc>
+          <w:tcPr>
+            <w:tcW w:type="dxa" w:w="2466"/>
+          </w:tcPr>
+          <w:p>
+            <w:pPr>
+              <w:spacing w:after="0"/>
+            </w:pPr>
+            <w:r>
+              <w:rPr>
+                <w:sz w:val="18"/>
+              </w:rPr>
+              <w:t>16.7 e Anexo V, 6.1</w:t>
             </w:r>
           </w:p>
         </w:tc>
@@ -8209,7 +9133,7 @@
               <w:rPr>
                 <w:sz w:val="18"/>
               </w:rPr>
-              <w:t>49</w:t>
+              <w:t>57</w:t>
             </w:r>
           </w:p>
         </w:tc>
@@ -8275,7 +9199,7 @@
               <w:rPr>
                 <w:sz w:val="18"/>
               </w:rPr>
-              <w:t>50</w:t>
+              <w:t>58</w:t>
             </w:r>
           </w:p>
         </w:tc>
@@ -8341,7 +9265,7 @@
               <w:rPr>
                 <w:sz w:val="18"/>
               </w:rPr>
-              <w:t>51</w:t>
+              <w:t>59</w:t>
             </w:r>
           </w:p>
         </w:tc>
@@ -8407,7 +9331,7 @@
               <w:rPr>
                 <w:sz w:val="18"/>
               </w:rPr>
-              <w:t>52</w:t>
+              <w:t>60</w:t>
             </w:r>
           </w:p>
         </w:tc>
@@ -8473,7 +9397,7 @@
               <w:rPr>
                 <w:sz w:val="18"/>
               </w:rPr>
-              <w:t>53</w:t>
+              <w:t>61</w:t>
             </w:r>
           </w:p>
         </w:tc>
@@ -8539,7 +9463,7 @@
               <w:rPr>
                 <w:sz w:val="18"/>
               </w:rPr>
-              <w:t>54</w:t>
+              <w:t>62</w:t>
             </w:r>
           </w:p>
         </w:tc>
@@ -8605,7 +9529,7 @@
               <w:rPr>
                 <w:sz w:val="18"/>
               </w:rPr>
-              <w:t>55</w:t>
+              <w:t>63</w:t>
             </w:r>
           </w:p>
         </w:tc>
@@ -8638,6 +9562,138 @@
                 <w:sz w:val="18"/>
               </w:rPr>
               <w:t>16.8</w:t>
+            </w:r>
+          </w:p>
+        </w:tc>
+        <w:tc>
+          <w:tcPr>
+            <w:tcW w:type="dxa" w:w="2466"/>
+          </w:tcPr>
+          <w:p>
+            <w:pPr>
+              <w:spacing w:after="0"/>
+            </w:pPr>
+            <w:r>
+              <w:rPr>
+                <w:sz w:val="18"/>
+              </w:rPr>
+              <w:t>☐</w:t>
+            </w:r>
+          </w:p>
+        </w:tc>
+      </w:tr>
+      <w:tr>
+        <w:tc>
+          <w:tcPr>
+            <w:tcW w:type="dxa" w:w="2466"/>
+          </w:tcPr>
+          <w:p>
+            <w:pPr>
+              <w:spacing w:after="0"/>
+            </w:pPr>
+            <w:r>
+              <w:rPr>
+                <w:sz w:val="18"/>
+              </w:rPr>
+              <w:t>64</w:t>
+            </w:r>
+          </w:p>
+        </w:tc>
+        <w:tc>
+          <w:tcPr>
+            <w:tcW w:type="dxa" w:w="2466"/>
+          </w:tcPr>
+          <w:p>
+            <w:pPr>
+              <w:spacing w:after="0"/>
+            </w:pPr>
+            <w:r>
+              <w:rPr>
+                <w:sz w:val="18"/>
+              </w:rPr>
+              <w:t>Concluir a obra em 24 meses a partir da primeira liberação do recurso (36 meses para longa de animação)</w:t>
+            </w:r>
+          </w:p>
+        </w:tc>
+        <w:tc>
+          <w:tcPr>
+            <w:tcW w:type="dxa" w:w="2466"/>
+          </w:tcPr>
+          <w:p>
+            <w:pPr>
+              <w:spacing w:after="0"/>
+            </w:pPr>
+            <w:r>
+              <w:rPr>
+                <w:sz w:val="18"/>
+              </w:rPr>
+              <w:t>Anexo V, 8.2</w:t>
+            </w:r>
+          </w:p>
+        </w:tc>
+        <w:tc>
+          <w:tcPr>
+            <w:tcW w:type="dxa" w:w="2466"/>
+          </w:tcPr>
+          <w:p>
+            <w:pPr>
+              <w:spacing w:after="0"/>
+            </w:pPr>
+            <w:r>
+              <w:rPr>
+                <w:sz w:val="18"/>
+              </w:rPr>
+              <w:t>☐</w:t>
+            </w:r>
+          </w:p>
+        </w:tc>
+      </w:tr>
+      <w:tr>
+        <w:tc>
+          <w:tcPr>
+            <w:tcW w:type="dxa" w:w="2466"/>
+          </w:tcPr>
+          <w:p>
+            <w:pPr>
+              <w:spacing w:after="0"/>
+            </w:pPr>
+            <w:r>
+              <w:rPr>
+                <w:sz w:val="18"/>
+              </w:rPr>
+              <w:t>65</w:t>
+            </w:r>
+          </w:p>
+        </w:tc>
+        <w:tc>
+          <w:tcPr>
+            <w:tcW w:type="dxa" w:w="2466"/>
+          </w:tcPr>
+          <w:p>
+            <w:pPr>
+              <w:spacing w:after="0"/>
+            </w:pPr>
+            <w:r>
+              <w:rPr>
+                <w:sz w:val="18"/>
+              </w:rPr>
+              <w:t>Repassar ao FSA a parte das receitas por 7 anos depois da primeira exibição comercial</w:t>
+            </w:r>
+          </w:p>
+        </w:tc>
+        <w:tc>
+          <w:tcPr>
+            <w:tcW w:type="dxa" w:w="2466"/>
+          </w:tcPr>
+          <w:p>
+            <w:pPr>
+              <w:spacing w:after="0"/>
+            </w:pPr>
+            <w:r>
+              <w:rPr>
+                <w:sz w:val="18"/>
+              </w:rPr>
+              <w:t>Anexo V, 10</w:t>
             </w:r>
           </w:p>
         </w:tc>
@@ -8711,10 +9767,10 @@
         <w:rPr>
           <w:b/>
         </w:rPr>
-        <w:t>Os nove anexos não estavam no PDF recebido.</w:t>
+        <w:t>Recebidos e lidos: Anexos I, II e V.</w:t>
       </w:r>
       <w:r>
-        <w:t xml:space="preserve"> O quadro mostra o que o texto do edital diz sobre cada um. O conteúdo real precisa ser conferido quando os anexos forem baixados em www.fomento.sp.gov.br.</w:t>
+        <w:t xml:space="preserve"> Para os demais, o quadro mostra o que o texto do edital diz sobre eles. O conteúdo precisa ser conferido quando forem baixados em www.fomento.sp.gov.br.</w:t>
       </w:r>
       <w:r/>
     </w:p>
@@ -8725,15 +9781,16 @@
         <w:tblLook w:firstColumn="1" w:firstRow="1" w:lastColumn="0" w:lastRow="0" w:noHBand="0" w:noVBand="1" w:val="04A0"/>
       </w:tblPr>
       <w:tblGrid>
-        <w:gridCol w:w="2466"/>
-        <w:gridCol w:w="2466"/>
-        <w:gridCol w:w="2466"/>
-        <w:gridCol w:w="2466"/>
+        <w:gridCol w:w="1973"/>
+        <w:gridCol w:w="1973"/>
+        <w:gridCol w:w="1973"/>
+        <w:gridCol w:w="1973"/>
+        <w:gridCol w:w="1973"/>
       </w:tblGrid>
       <w:tr>
         <w:tc>
           <w:tcPr>
-            <w:tcW w:type="dxa" w:w="2466"/>
+            <w:tcW w:type="dxa" w:w="1973"/>
             <w:shd w:val="clear" w:color="auto" w:fill="E8EEF6"/>
           </w:tcPr>
           <w:p>
@@ -8751,7 +9808,7 @@
         </w:tc>
         <w:tc>
           <w:tcPr>
-            <w:tcW w:type="dxa" w:w="2466"/>
+            <w:tcW w:type="dxa" w:w="1973"/>
             <w:shd w:val="clear" w:color="auto" w:fill="E8EEF6"/>
           </w:tcPr>
           <w:p>
@@ -8769,7 +9826,7 @@
         </w:tc>
         <w:tc>
           <w:tcPr>
-            <w:tcW w:type="dxa" w:w="2466"/>
+            <w:tcW w:type="dxa" w:w="1973"/>
             <w:shd w:val="clear" w:color="auto" w:fill="E8EEF6"/>
           </w:tcPr>
           <w:p>
@@ -8781,13 +9838,13 @@
                 <w:b/>
                 <w:sz w:val="18"/>
               </w:rPr>
-              <w:t>Para que serve, segundo o edital</w:t>
-            </w:r>
-          </w:p>
-        </w:tc>
-        <w:tc>
-          <w:tcPr>
-            <w:tcW w:type="dxa" w:w="2466"/>
+              <w:t>Para que serve</w:t>
+            </w:r>
+          </w:p>
+        </w:tc>
+        <w:tc>
+          <w:tcPr>
+            <w:tcW w:type="dxa" w:w="1973"/>
             <w:shd w:val="clear" w:color="auto" w:fill="E8EEF6"/>
           </w:tcPr>
           <w:p>
@@ -8800,6 +9857,24 @@
                 <w:sz w:val="18"/>
               </w:rPr>
               <w:t>Quando</w:t>
+            </w:r>
+          </w:p>
+        </w:tc>
+        <w:tc>
+          <w:tcPr>
+            <w:tcW w:type="dxa" w:w="1973"/>
+            <w:shd w:val="clear" w:color="auto" w:fill="E8EEF6"/>
+          </w:tcPr>
+          <w:p>
+            <w:pPr>
+              <w:spacing w:after="0"/>
+            </w:pPr>
+            <w:r>
+              <w:rPr>
+                <w:b/>
+                <w:sz w:val="18"/>
+              </w:rPr>
+              <w:t>Situação</w:t>
             </w:r>
           </w:p>
         </w:tc>
@@ -8807,7 +9882,7 @@
       <w:tr>
         <w:tc>
           <w:tcPr>
-            <w:tcW w:type="dxa" w:w="2466"/>
+            <w:tcW w:type="dxa" w:w="1973"/>
           </w:tcPr>
           <w:p>
             <w:pPr>
@@ -8823,7 +9898,7 @@
         </w:tc>
         <w:tc>
           <w:tcPr>
-            <w:tcW w:type="dxa" w:w="2466"/>
+            <w:tcW w:type="dxa" w:w="1973"/>
           </w:tcPr>
           <w:p>
             <w:pPr>
@@ -8839,7 +9914,7 @@
         </w:tc>
         <w:tc>
           <w:tcPr>
-            <w:tcW w:type="dxa" w:w="2466"/>
+            <w:tcW w:type="dxa" w:w="1973"/>
           </w:tcPr>
           <w:p>
             <w:pPr>
@@ -8855,7 +9930,7 @@
         </w:tc>
         <w:tc>
           <w:tcPr>
-            <w:tcW w:type="dxa" w:w="2466"/>
+            <w:tcW w:type="dxa" w:w="1973"/>
           </w:tcPr>
           <w:p>
             <w:pPr>
@@ -8866,6 +9941,22 @@
                 <w:sz w:val="18"/>
               </w:rPr>
               <w:t>Inscrição e habilitação</w:t>
+            </w:r>
+          </w:p>
+        </w:tc>
+        <w:tc>
+          <w:tcPr>
+            <w:tcW w:type="dxa" w:w="1973"/>
+          </w:tcPr>
+          <w:p>
+            <w:pPr>
+              <w:spacing w:after="0"/>
+            </w:pPr>
+            <w:r>
+              <w:rPr>
+                <w:sz w:val="18"/>
+              </w:rPr>
+              <w:t>Lido</w:t>
             </w:r>
           </w:p>
         </w:tc>
@@ -8873,7 +9964,7 @@
       <w:tr>
         <w:tc>
           <w:tcPr>
-            <w:tcW w:type="dxa" w:w="2466"/>
+            <w:tcW w:type="dxa" w:w="1973"/>
           </w:tcPr>
           <w:p>
             <w:pPr>
@@ -8889,7 +9980,7 @@
         </w:tc>
         <w:tc>
           <w:tcPr>
-            <w:tcW w:type="dxa" w:w="2466"/>
+            <w:tcW w:type="dxa" w:w="1973"/>
           </w:tcPr>
           <w:p>
             <w:pPr>
@@ -8905,7 +9996,7 @@
         </w:tc>
         <w:tc>
           <w:tcPr>
-            <w:tcW w:type="dxa" w:w="2466"/>
+            <w:tcW w:type="dxa" w:w="1973"/>
           </w:tcPr>
           <w:p>
             <w:pPr>
@@ -8921,7 +10012,7 @@
         </w:tc>
         <w:tc>
           <w:tcPr>
-            <w:tcW w:type="dxa" w:w="2466"/>
+            <w:tcW w:type="dxa" w:w="1973"/>
           </w:tcPr>
           <w:p>
             <w:pPr>
@@ -8932,6 +10023,22 @@
                 <w:sz w:val="18"/>
               </w:rPr>
               <w:t>Inscrição</w:t>
+            </w:r>
+          </w:p>
+        </w:tc>
+        <w:tc>
+          <w:tcPr>
+            <w:tcW w:type="dxa" w:w="1973"/>
+          </w:tcPr>
+          <w:p>
+            <w:pPr>
+              <w:spacing w:after="0"/>
+            </w:pPr>
+            <w:r>
+              <w:rPr>
+                <w:sz w:val="18"/>
+              </w:rPr>
+              <w:t>Lido</w:t>
             </w:r>
           </w:p>
         </w:tc>
@@ -8939,7 +10046,7 @@
       <w:tr>
         <w:tc>
           <w:tcPr>
-            <w:tcW w:type="dxa" w:w="2466"/>
+            <w:tcW w:type="dxa" w:w="1973"/>
           </w:tcPr>
           <w:p>
             <w:pPr>
@@ -8955,7 +10062,7 @@
         </w:tc>
         <w:tc>
           <w:tcPr>
-            <w:tcW w:type="dxa" w:w="2466"/>
+            <w:tcW w:type="dxa" w:w="1973"/>
           </w:tcPr>
           <w:p>
             <w:pPr>
@@ -8971,7 +10078,7 @@
         </w:tc>
         <w:tc>
           <w:tcPr>
-            <w:tcW w:type="dxa" w:w="2466"/>
+            <w:tcW w:type="dxa" w:w="1973"/>
           </w:tcPr>
           <w:p>
             <w:pPr>
@@ -8987,7 +10094,7 @@
         </w:tc>
         <w:tc>
           <w:tcPr>
-            <w:tcW w:type="dxa" w:w="2466"/>
+            <w:tcW w:type="dxa" w:w="1973"/>
           </w:tcPr>
           <w:p>
             <w:pPr>
@@ -8998,6 +10105,22 @@
                 <w:sz w:val="18"/>
               </w:rPr>
               <w:t>Inscrição, se optar</w:t>
+            </w:r>
+          </w:p>
+        </w:tc>
+        <w:tc>
+          <w:tcPr>
+            <w:tcW w:type="dxa" w:w="1973"/>
+          </w:tcPr>
+          <w:p>
+            <w:pPr>
+              <w:spacing w:after="0"/>
+            </w:pPr>
+            <w:r>
+              <w:rPr>
+                <w:sz w:val="18"/>
+              </w:rPr>
+              <w:t>Falta</w:t>
             </w:r>
           </w:p>
         </w:tc>
@@ -9005,7 +10128,7 @@
       <w:tr>
         <w:tc>
           <w:tcPr>
-            <w:tcW w:type="dxa" w:w="2466"/>
+            <w:tcW w:type="dxa" w:w="1973"/>
           </w:tcPr>
           <w:p>
             <w:pPr>
@@ -9021,7 +10144,7 @@
         </w:tc>
         <w:tc>
           <w:tcPr>
-            <w:tcW w:type="dxa" w:w="2466"/>
+            <w:tcW w:type="dxa" w:w="1973"/>
           </w:tcPr>
           <w:p>
             <w:pPr>
@@ -9037,7 +10160,7 @@
         </w:tc>
         <w:tc>
           <w:tcPr>
-            <w:tcW w:type="dxa" w:w="2466"/>
+            <w:tcW w:type="dxa" w:w="1973"/>
           </w:tcPr>
           <w:p>
             <w:pPr>
@@ -9053,7 +10176,7 @@
         </w:tc>
         <w:tc>
           <w:tcPr>
-            <w:tcW w:type="dxa" w:w="2466"/>
+            <w:tcW w:type="dxa" w:w="1973"/>
           </w:tcPr>
           <w:p>
             <w:pPr>
@@ -9064,6 +10187,22 @@
                 <w:sz w:val="18"/>
               </w:rPr>
               <w:t>Execução</w:t>
+            </w:r>
+          </w:p>
+        </w:tc>
+        <w:tc>
+          <w:tcPr>
+            <w:tcW w:type="dxa" w:w="1973"/>
+          </w:tcPr>
+          <w:p>
+            <w:pPr>
+              <w:spacing w:after="0"/>
+            </w:pPr>
+            <w:r>
+              <w:rPr>
+                <w:sz w:val="18"/>
+              </w:rPr>
+              <w:t>Falta</w:t>
             </w:r>
           </w:p>
         </w:tc>
@@ -9071,7 +10210,7 @@
       <w:tr>
         <w:tc>
           <w:tcPr>
-            <w:tcW w:type="dxa" w:w="2466"/>
+            <w:tcW w:type="dxa" w:w="1973"/>
           </w:tcPr>
           <w:p>
             <w:pPr>
@@ -9087,7 +10226,7 @@
         </w:tc>
         <w:tc>
           <w:tcPr>
-            <w:tcW w:type="dxa" w:w="2466"/>
+            <w:tcW w:type="dxa" w:w="1973"/>
           </w:tcPr>
           <w:p>
             <w:pPr>
@@ -9103,7 +10242,7 @@
         </w:tc>
         <w:tc>
           <w:tcPr>
-            <w:tcW w:type="dxa" w:w="2466"/>
+            <w:tcW w:type="dxa" w:w="1973"/>
           </w:tcPr>
           <w:p>
             <w:pPr>
@@ -9132,7 +10271,7 @@
         </w:tc>
         <w:tc>
           <w:tcPr>
-            <w:tcW w:type="dxa" w:w="2466"/>
+            <w:tcW w:type="dxa" w:w="1973"/>
           </w:tcPr>
           <w:p>
             <w:pPr>
@@ -9143,6 +10282,22 @@
                 <w:sz w:val="18"/>
               </w:rPr>
               <w:t>Contratação</w:t>
+            </w:r>
+          </w:p>
+        </w:tc>
+        <w:tc>
+          <w:tcPr>
+            <w:tcW w:type="dxa" w:w="1973"/>
+          </w:tcPr>
+          <w:p>
+            <w:pPr>
+              <w:spacing w:after="0"/>
+            </w:pPr>
+            <w:r>
+              <w:rPr>
+                <w:sz w:val="18"/>
+              </w:rPr>
+              <w:t>Lido</w:t>
             </w:r>
           </w:p>
         </w:tc>
@@ -9150,7 +10305,7 @@
       <w:tr>
         <w:tc>
           <w:tcPr>
-            <w:tcW w:type="dxa" w:w="2466"/>
+            <w:tcW w:type="dxa" w:w="1973"/>
           </w:tcPr>
           <w:p>
             <w:pPr>
@@ -9166,7 +10321,7 @@
         </w:tc>
         <w:tc>
           <w:tcPr>
-            <w:tcW w:type="dxa" w:w="2466"/>
+            <w:tcW w:type="dxa" w:w="1973"/>
           </w:tcPr>
           <w:p>
             <w:pPr>
@@ -9182,7 +10337,7 @@
         </w:tc>
         <w:tc>
           <w:tcPr>
-            <w:tcW w:type="dxa" w:w="2466"/>
+            <w:tcW w:type="dxa" w:w="1973"/>
           </w:tcPr>
           <w:p>
             <w:pPr>
@@ -9198,7 +10353,7 @@
         </w:tc>
         <w:tc>
           <w:tcPr>
-            <w:tcW w:type="dxa" w:w="2466"/>
+            <w:tcW w:type="dxa" w:w="1973"/>
           </w:tcPr>
           <w:p>
             <w:pPr>
@@ -9209,6 +10364,22 @@
                 <w:sz w:val="18"/>
               </w:rPr>
               <w:t>Contratação</w:t>
+            </w:r>
+          </w:p>
+        </w:tc>
+        <w:tc>
+          <w:tcPr>
+            <w:tcW w:type="dxa" w:w="1973"/>
+          </w:tcPr>
+          <w:p>
+            <w:pPr>
+              <w:spacing w:after="0"/>
+            </w:pPr>
+            <w:r>
+              <w:rPr>
+                <w:sz w:val="18"/>
+              </w:rPr>
+              <w:t>Falta</w:t>
             </w:r>
           </w:p>
         </w:tc>
@@ -9216,7 +10387,7 @@
       <w:tr>
         <w:tc>
           <w:tcPr>
-            <w:tcW w:type="dxa" w:w="2466"/>
+            <w:tcW w:type="dxa" w:w="1973"/>
           </w:tcPr>
           <w:p>
             <w:pPr>
@@ -9232,7 +10403,7 @@
         </w:tc>
         <w:tc>
           <w:tcPr>
-            <w:tcW w:type="dxa" w:w="2466"/>
+            <w:tcW w:type="dxa" w:w="1973"/>
           </w:tcPr>
           <w:p>
             <w:pPr>
@@ -9248,7 +10419,7 @@
         </w:tc>
         <w:tc>
           <w:tcPr>
-            <w:tcW w:type="dxa" w:w="2466"/>
+            <w:tcW w:type="dxa" w:w="1973"/>
           </w:tcPr>
           <w:p>
             <w:pPr>
@@ -9264,7 +10435,7 @@
         </w:tc>
         <w:tc>
           <w:tcPr>
-            <w:tcW w:type="dxa" w:w="2466"/>
+            <w:tcW w:type="dxa" w:w="1973"/>
           </w:tcPr>
           <w:p>
             <w:pPr>
@@ -9275,6 +10446,22 @@
                 <w:sz w:val="18"/>
               </w:rPr>
               <w:t>Contratação</w:t>
+            </w:r>
+          </w:p>
+        </w:tc>
+        <w:tc>
+          <w:tcPr>
+            <w:tcW w:type="dxa" w:w="1973"/>
+          </w:tcPr>
+          <w:p>
+            <w:pPr>
+              <w:spacing w:after="0"/>
+            </w:pPr>
+            <w:r>
+              <w:rPr>
+                <w:sz w:val="18"/>
+              </w:rPr>
+              <w:t>Falta</w:t>
             </w:r>
           </w:p>
         </w:tc>
@@ -9282,7 +10469,7 @@
       <w:tr>
         <w:tc>
           <w:tcPr>
-            <w:tcW w:type="dxa" w:w="2466"/>
+            <w:tcW w:type="dxa" w:w="1973"/>
           </w:tcPr>
           <w:p>
             <w:pPr>
@@ -9298,7 +10485,7 @@
         </w:tc>
         <w:tc>
           <w:tcPr>
-            <w:tcW w:type="dxa" w:w="2466"/>
+            <w:tcW w:type="dxa" w:w="1973"/>
           </w:tcPr>
           <w:p>
             <w:pPr>
@@ -9314,7 +10501,7 @@
         </w:tc>
         <w:tc>
           <w:tcPr>
-            <w:tcW w:type="dxa" w:w="2466"/>
+            <w:tcW w:type="dxa" w:w="1973"/>
           </w:tcPr>
           <w:p>
             <w:pPr>
@@ -9330,7 +10517,7 @@
         </w:tc>
         <w:tc>
           <w:tcPr>
-            <w:tcW w:type="dxa" w:w="2466"/>
+            <w:tcW w:type="dxa" w:w="1973"/>
           </w:tcPr>
           <w:p>
             <w:pPr>
@@ -9341,6 +10528,22 @@
                 <w:sz w:val="18"/>
               </w:rPr>
               <w:t>Contratação</w:t>
+            </w:r>
+          </w:p>
+        </w:tc>
+        <w:tc>
+          <w:tcPr>
+            <w:tcW w:type="dxa" w:w="1973"/>
+          </w:tcPr>
+          <w:p>
+            <w:pPr>
+              <w:spacing w:after="0"/>
+            </w:pPr>
+            <w:r>
+              <w:rPr>
+                <w:sz w:val="18"/>
+              </w:rPr>
+              <w:t>Falta</w:t>
             </w:r>
           </w:p>
         </w:tc>
@@ -9348,7 +10551,7 @@
       <w:tr>
         <w:tc>
           <w:tcPr>
-            <w:tcW w:type="dxa" w:w="2466"/>
+            <w:tcW w:type="dxa" w:w="1973"/>
           </w:tcPr>
           <w:p>
             <w:pPr>
@@ -9364,7 +10567,7 @@
         </w:tc>
         <w:tc>
           <w:tcPr>
-            <w:tcW w:type="dxa" w:w="2466"/>
+            <w:tcW w:type="dxa" w:w="1973"/>
           </w:tcPr>
           <w:p>
             <w:pPr>
@@ -9380,7 +10583,7 @@
         </w:tc>
         <w:tc>
           <w:tcPr>
-            <w:tcW w:type="dxa" w:w="2466"/>
+            <w:tcW w:type="dxa" w:w="1973"/>
           </w:tcPr>
           <w:p>
             <w:pPr>
@@ -9396,7 +10599,7 @@
         </w:tc>
         <w:tc>
           <w:tcPr>
-            <w:tcW w:type="dxa" w:w="2466"/>
+            <w:tcW w:type="dxa" w:w="1973"/>
           </w:tcPr>
           <w:p>
             <w:pPr>
@@ -9407,12 +10610,85 @@
                 <w:sz w:val="18"/>
               </w:rPr>
               <w:t>Habilitação</w:t>
+            </w:r>
+          </w:p>
+        </w:tc>
+        <w:tc>
+          <w:tcPr>
+            <w:tcW w:type="dxa" w:w="1973"/>
+          </w:tcPr>
+          <w:p>
+            <w:pPr>
+              <w:spacing w:after="0"/>
+            </w:pPr>
+            <w:r>
+              <w:rPr>
+                <w:sz w:val="18"/>
+              </w:rPr>
+              <w:t>Falta</w:t>
             </w:r>
           </w:p>
         </w:tc>
       </w:tr>
     </w:tbl>
     <w:p>
+      <w:r/>
+    </w:p>
+    <w:p>
+      <w:pPr>
+        <w:pStyle w:val="Heading3"/>
+      </w:pPr>
+      <w:r>
+        <w:rPr>
+          <w:rFonts w:ascii="Arial" w:hAnsi="Arial"/>
+          <w:color w:val="1F4E79"/>
+        </w:rPr>
+        <w:t>O que os anexos lidos acrescentam</w:t>
+      </w:r>
+      <w:r>
+        <w:rPr>
+          <w:rFonts w:ascii="Arial" w:hAnsi="Arial"/>
+          <w:color w:val="1F4E79"/>
+        </w:rPr>
+      </w:r>
+    </w:p>
+    <w:p>
+      <w:r/>
+      <w:r>
+        <w:rPr>
+          <w:b/>
+        </w:rPr>
+        <w:t>Anexo I. Declaração de composição da equipe.</w:t>
+      </w:r>
+      <w:r>
+        <w:t xml:space="preserve"> É preenchido no próprio sistema. Pede título do projeto, proponente, CNPJ, módulo e o percentual da equipe que se enquadra. Depois, uma tabela com nome, CPF, função e, para cada pessoa, se é negra, indígena, com deficiência, LGBTQIAPN+, mulher ou "N/A". Só valem as 18 funções do item 5.3. Os documentos de comprovação vão na habilitação, em PDF (ver item 43 da ficha). Se a ficha técnica mudar, o representante legal responde por manter os 30%.</w:t>
+      </w:r>
+      <w:r/>
+    </w:p>
+    <w:p>
+      <w:r/>
+      <w:r>
+        <w:rPr>
+          <w:b/>
+        </w:rPr>
+        <w:t>Anexo II. Termo de Participação.</w:t>
+      </w:r>
+      <w:r>
+        <w:t xml:space="preserve"> Uma página por pessoa, com nome, RG, CPF, endereço completo, nome do projeto, número do edital e função. Há um campo opcional de autodeclaração (negra, indígena, com deficiência, LGBTQIAPN+ ou mulher), que deve ser preenchido por quem compõe os 30%. Assinatura só pelo Gov.br ou com certificado digital. Assinam os principais da ficha técnica, quem compõe os 30% e todos os demais ocupantes das mesmas funções.</w:t>
+      </w:r>
+      <w:r/>
+    </w:p>
+    <w:p>
+      <w:r/>
+      <w:r>
+        <w:rPr>
+          <w:b/>
+        </w:rPr>
+        <w:t>Anexo V. Contratação, retorno e licenciamento.</w:t>
+      </w:r>
+      <w:r>
+        <w:t xml:space="preserve"> Prevalece sobre o edital. Traz as condições de contratação (itens 47 a 56 da ficha), o prazo de execução, o período das despesas aceitas, as regras de retorno ao FSA e o licenciamento obrigatório para TV e streaming. Os pontos principais estão nas partes 4, 5.4 e 8.</w:t>
+      </w:r>
       <w:r/>
     </w:p>
     <w:p>
@@ -11138,6 +12414,256 @@
           </w:p>
         </w:tc>
       </w:tr>
+      <w:tr>
+        <w:tc>
+          <w:tcPr>
+            <w:tcW w:type="dxa" w:w="3289"/>
+          </w:tcPr>
+          <w:p>
+            <w:pPr>
+              <w:spacing w:after="0"/>
+            </w:pPr>
+            <w:r>
+              <w:rPr>
+                <w:sz w:val="18"/>
+              </w:rPr>
+              <w:t>Não pedir a aprovação para captação na ANCINE em 30 dias depois do resultado</w:t>
+            </w:r>
+          </w:p>
+        </w:tc>
+        <w:tc>
+          <w:tcPr>
+            <w:tcW w:type="dxa" w:w="3289"/>
+          </w:tcPr>
+          <w:p>
+            <w:pPr>
+              <w:spacing w:after="0"/>
+            </w:pPr>
+            <w:r>
+              <w:rPr>
+                <w:sz w:val="18"/>
+              </w:rPr>
+              <w:t>Anexo V, 5.3</w:t>
+            </w:r>
+          </w:p>
+        </w:tc>
+        <w:tc>
+          <w:tcPr>
+            <w:tcW w:type="dxa" w:w="3289"/>
+          </w:tcPr>
+          <w:p>
+            <w:pPr>
+              <w:spacing w:after="0"/>
+            </w:pPr>
+            <w:r>
+              <w:rPr>
+                <w:sz w:val="18"/>
+              </w:rPr>
+              <w:t>Não. A contratação é cancelada</w:t>
+            </w:r>
+          </w:p>
+        </w:tc>
+      </w:tr>
+      <w:tr>
+        <w:tc>
+          <w:tcPr>
+            <w:tcW w:type="dxa" w:w="3289"/>
+          </w:tcPr>
+          <w:p>
+            <w:pPr>
+              <w:spacing w:after="0"/>
+            </w:pPr>
+            <w:r>
+              <w:rPr>
+                <w:sz w:val="18"/>
+              </w:rPr>
+              <w:t>Não concluir os procedimentos de contratação em 120 dias</w:t>
+            </w:r>
+          </w:p>
+        </w:tc>
+        <w:tc>
+          <w:tcPr>
+            <w:tcW w:type="dxa" w:w="3289"/>
+          </w:tcPr>
+          <w:p>
+            <w:pPr>
+              <w:spacing w:after="0"/>
+            </w:pPr>
+            <w:r>
+              <w:rPr>
+                <w:sz w:val="18"/>
+              </w:rPr>
+              <w:t>Anexo V, 5.4</w:t>
+            </w:r>
+          </w:p>
+        </w:tc>
+        <w:tc>
+          <w:tcPr>
+            <w:tcW w:type="dxa" w:w="3289"/>
+          </w:tcPr>
+          <w:p>
+            <w:pPr>
+              <w:spacing w:after="0"/>
+            </w:pPr>
+            <w:r>
+              <w:rPr>
+                <w:sz w:val="18"/>
+              </w:rPr>
+              <w:t>Não. O prazo não é prorrogável</w:t>
+            </w:r>
+          </w:p>
+        </w:tc>
+      </w:tr>
+      <w:tr>
+        <w:tc>
+          <w:tcPr>
+            <w:tcW w:type="dxa" w:w="3289"/>
+          </w:tcPr>
+          <w:p>
+            <w:pPr>
+              <w:spacing w:after="0"/>
+            </w:pPr>
+            <w:r>
+              <w:rPr>
+                <w:sz w:val="18"/>
+              </w:rPr>
+              <w:t>Cinema sem distribuidora, ou TV e streaming sem canal licenciado</w:t>
+            </w:r>
+          </w:p>
+        </w:tc>
+        <w:tc>
+          <w:tcPr>
+            <w:tcW w:type="dxa" w:w="3289"/>
+          </w:tcPr>
+          <w:p>
+            <w:pPr>
+              <w:spacing w:after="0"/>
+            </w:pPr>
+            <w:r>
+              <w:rPr>
+                <w:sz w:val="18"/>
+              </w:rPr>
+              <w:t>Anexo V, 5.8 I e II</w:t>
+            </w:r>
+          </w:p>
+        </w:tc>
+        <w:tc>
+          <w:tcPr>
+            <w:tcW w:type="dxa" w:w="3289"/>
+          </w:tcPr>
+          <w:p>
+            <w:pPr>
+              <w:spacing w:after="0"/>
+            </w:pPr>
+            <w:r>
+              <w:rPr>
+                <w:sz w:val="18"/>
+              </w:rPr>
+              <w:t>Sim, se o contrato for fechado a tempo</w:t>
+            </w:r>
+          </w:p>
+        </w:tc>
+      </w:tr>
+      <w:tr>
+        <w:tc>
+          <w:tcPr>
+            <w:tcW w:type="dxa" w:w="3289"/>
+          </w:tcPr>
+          <w:p>
+            <w:pPr>
+              <w:spacing w:after="0"/>
+            </w:pPr>
+            <w:r>
+              <w:rPr>
+                <w:sz w:val="18"/>
+              </w:rPr>
+              <w:t>Distribuidora ou canal de TV com pendência fiscal ou cadastral</w:t>
+            </w:r>
+          </w:p>
+        </w:tc>
+        <w:tc>
+          <w:tcPr>
+            <w:tcW w:type="dxa" w:w="3289"/>
+          </w:tcPr>
+          <w:p>
+            <w:pPr>
+              <w:spacing w:after="0"/>
+            </w:pPr>
+            <w:r>
+              <w:rPr>
+                <w:sz w:val="18"/>
+              </w:rPr>
+              <w:t>Anexo V, 7.1</w:t>
+            </w:r>
+          </w:p>
+        </w:tc>
+        <w:tc>
+          <w:tcPr>
+            <w:tcW w:type="dxa" w:w="3289"/>
+          </w:tcPr>
+          <w:p>
+            <w:pPr>
+              <w:spacing w:after="0"/>
+            </w:pPr>
+            <w:r>
+              <w:rPr>
+                <w:sz w:val="18"/>
+              </w:rPr>
+              <w:t>Sim, regularizando ou trocando de parceiro</w:t>
+            </w:r>
+          </w:p>
+        </w:tc>
+      </w:tr>
+      <w:tr>
+        <w:tc>
+          <w:tcPr>
+            <w:tcW w:type="dxa" w:w="3289"/>
+          </w:tcPr>
+          <w:p>
+            <w:pPr>
+              <w:spacing w:after="0"/>
+            </w:pPr>
+            <w:r>
+              <w:rPr>
+                <w:sz w:val="18"/>
+              </w:rPr>
+              <w:t>Obra já com CPB, ou com direito cedido de graça</w:t>
+            </w:r>
+          </w:p>
+        </w:tc>
+        <w:tc>
+          <w:tcPr>
+            <w:tcW w:type="dxa" w:w="3289"/>
+          </w:tcPr>
+          <w:p>
+            <w:pPr>
+              <w:spacing w:after="0"/>
+            </w:pPr>
+            <w:r>
+              <w:rPr>
+                <w:sz w:val="18"/>
+              </w:rPr>
+              <w:t>Anexo V, 5.8 VII e VIII</w:t>
+            </w:r>
+          </w:p>
+        </w:tc>
+        <w:tc>
+          <w:tcPr>
+            <w:tcW w:type="dxa" w:w="3289"/>
+          </w:tcPr>
+          <w:p>
+            <w:pPr>
+              <w:spacing w:after="0"/>
+            </w:pPr>
+            <w:r>
+              <w:rPr>
+                <w:sz w:val="18"/>
+              </w:rPr>
+              <w:t>Não</w:t>
+            </w:r>
+          </w:p>
+        </w:tc>
+      </w:tr>
     </w:tbl>
     <w:p>
       <w:r/>
@@ -11425,7 +12951,7 @@
               <w:rPr>
                 <w:sz w:val="18"/>
               </w:rPr>
-              <w:t>O Anexo V prevalece sobre o edital em caso de conflito, e ainda não foi lido</w:t>
+              <w:t>A contratação só se conclui depois que a SCEIC desembolsa sua parte e paga os agentes financeiros. O calendário não depende da produtora</w:t>
             </w:r>
           </w:p>
         </w:tc>
@@ -11441,7 +12967,7 @@
               <w:rPr>
                 <w:sz w:val="18"/>
               </w:rPr>
-              <w:t>16.4</w:t>
+              <w:t>Anexo V, 6.1</w:t>
             </w:r>
           </w:p>
         </w:tc>
@@ -11731,6 +13257,42 @@
         <w:rPr>
           <w:b/>
         </w:rPr>
+        <w:t>Chegar com parceiro de mercado.</w:t>
+      </w:r>
+      <w:r>
+        <w:t xml:space="preserve"> Distribuidora (cinema) ou canal de TV (TV e streaming) é exigência da contratação (Anexo V, 5.8). Ter a carta ou o contrato já na inscrição reforça o plano de distribuição (item 7.1.1 q) e o critério E, e evita correria depois.</w:t>
+      </w:r>
+      <w:r/>
+    </w:p>
+    <w:p>
+      <w:pPr>
+        <w:pStyle w:val="ListNumber"/>
+        <w:spacing w:line="240" w:lineRule="auto"/>
+        <w:ind w:left="720"/>
+      </w:pPr>
+      <w:r/>
+      <w:r>
+        <w:rPr>
+          <w:b/>
+        </w:rPr>
+        <w:t>Projeto já aprovado na ANCINE sai na frente.</w:t>
+      </w:r>
+      <w:r>
+        <w:t xml:space="preserve"> Quem ainda não tem aprovação para captação corre contra 30 dias depois do resultado (Anexo V, 5.3).</w:t>
+      </w:r>
+      <w:r/>
+    </w:p>
+    <w:p>
+      <w:pPr>
+        <w:pStyle w:val="ListNumber"/>
+        <w:spacing w:line="240" w:lineRule="auto"/>
+        <w:ind w:left="720"/>
+      </w:pPr>
+      <w:r/>
+      <w:r>
+        <w:rPr>
+          <w:b/>
+        </w:rPr>
         <w:t>Pitching de 10 minutos.</w:t>
       </w:r>
       <w:r>
@@ -14728,7 +16290,7 @@
               <w:rPr>
                 <w:sz w:val="18"/>
               </w:rPr>
-              <w:t>Considerar o orçamento total da obra</w:t>
+              <w:t>O Anexo V (5.8 VI) diz "orçamento total do projeto, nos termos da IN 158". Como retorno e licença usam a parte brasileira (10.8 e 11.12), a base provável é o orçamento brasileiro. Planejar pelo orçamento total, até confirmação</w:t>
             </w:r>
           </w:p>
         </w:tc>
@@ -14942,7 +16504,7 @@
               <w:rPr>
                 <w:sz w:val="18"/>
               </w:rPr>
-              <w:t>O edital define telefilme, mas o objeto não inclui telefilme</w:t>
+              <w:t>O edital define telefilme, e o Anexo V inclui telefilme, variedades e reality show entre os objetos financiáveis. Mas o objeto do edital (1.2) só admite longa e obra seriada</w:t>
             </w:r>
           </w:p>
         </w:tc>
@@ -14958,7 +16520,7 @@
               <w:rPr>
                 <w:sz w:val="18"/>
               </w:rPr>
-              <w:t>2.1 f e 1.2</w:t>
+              <w:t>2.1 f, 1.2 e Anexo V, 3.1</w:t>
             </w:r>
           </w:p>
         </w:tc>
@@ -14974,7 +16536,7 @@
               <w:rPr>
                 <w:sz w:val="18"/>
               </w:rPr>
-              <w:t>Não inscrever telefilme</w:t>
+              <w:t>O Anexo V descreve o que o FSA pode financiar em geral. O edital define o que esta chamada aceita. Não inscrever telefilme</w:t>
             </w:r>
           </w:p>
         </w:tc>
@@ -15056,7 +16618,7 @@
               <w:rPr>
                 <w:sz w:val="18"/>
               </w:rPr>
-              <w:t>Conferir no Anexo V</w:t>
+              <w:t>O Anexo V só diz que documento estrangeiro vale com tradução simples (5.9.1). Na inscrição, mandar o portfólio e o contrato de coprodução assinado</w:t>
             </w:r>
           </w:p>
         </w:tc>
@@ -15155,6 +16717,252 @@
                 <w:sz w:val="18"/>
               </w:rPr>
               <w:t>Conferir a data no site oficial ao baixar os anexos</w:t>
+            </w:r>
+          </w:p>
+        </w:tc>
+      </w:tr>
+      <w:tr>
+        <w:tc>
+          <w:tcPr>
+            <w:tcW w:type="dxa" w:w="1973"/>
+          </w:tcPr>
+          <w:p>
+            <w:pPr>
+              <w:spacing w:after="0"/>
+            </w:pPr>
+            <w:r>
+              <w:rPr>
+                <w:sz w:val="18"/>
+              </w:rPr>
+              <w:t>D9</w:t>
+            </w:r>
+          </w:p>
+        </w:tc>
+        <w:tc>
+          <w:tcPr>
+            <w:tcW w:type="dxa" w:w="1973"/>
+          </w:tcPr>
+          <w:p>
+            <w:pPr>
+              <w:spacing w:after="0"/>
+            </w:pPr>
+            <w:r>
+              <w:rPr>
+                <w:sz w:val="18"/>
+              </w:rPr>
+              <w:t>O Anexo I pede documento com foto também de quem é "N/A", ou seja, de todos os listados, não só de quem compõe os 30%</w:t>
+            </w:r>
+          </w:p>
+        </w:tc>
+        <w:tc>
+          <w:tcPr>
+            <w:tcW w:type="dxa" w:w="1973"/>
+          </w:tcPr>
+          <w:p>
+            <w:pPr>
+              <w:spacing w:after="0"/>
+            </w:pPr>
+            <w:r>
+              <w:rPr>
+                <w:sz w:val="18"/>
+              </w:rPr>
+              <w:t>Anexo I, instruções</w:t>
+            </w:r>
+          </w:p>
+        </w:tc>
+        <w:tc>
+          <w:tcPr>
+            <w:tcW w:type="dxa" w:w="1973"/>
+          </w:tcPr>
+          <w:p>
+            <w:pPr>
+              <w:spacing w:after="0"/>
+            </w:pPr>
+            <w:r>
+              <w:rPr>
+                <w:sz w:val="18"/>
+              </w:rPr>
+              <w:t>Reunir documento com foto de todas as pessoas do Anexo I</w:t>
+            </w:r>
+          </w:p>
+        </w:tc>
+        <w:tc>
+          <w:tcPr>
+            <w:tcW w:type="dxa" w:w="1973"/>
+          </w:tcPr>
+          <w:p>
+            <w:pPr>
+              <w:spacing w:after="0"/>
+            </w:pPr>
+            <w:r>
+              <w:rPr>
+                <w:sz w:val="18"/>
+              </w:rPr>
+              <w:t>Não é necessária</w:t>
+            </w:r>
+          </w:p>
+        </w:tc>
+      </w:tr>
+      <w:tr>
+        <w:tc>
+          <w:tcPr>
+            <w:tcW w:type="dxa" w:w="1973"/>
+          </w:tcPr>
+          <w:p>
+            <w:pPr>
+              <w:spacing w:after="0"/>
+            </w:pPr>
+            <w:r>
+              <w:rPr>
+                <w:sz w:val="18"/>
+              </w:rPr>
+              <w:t>D10</w:t>
+            </w:r>
+          </w:p>
+        </w:tc>
+        <w:tc>
+          <w:tcPr>
+            <w:tcW w:type="dxa" w:w="1973"/>
+          </w:tcPr>
+          <w:p>
+            <w:pPr>
+              <w:spacing w:after="0"/>
+            </w:pPr>
+            <w:r>
+              <w:rPr>
+                <w:sz w:val="18"/>
+              </w:rPr>
+              <w:t>O modelo do Anexo II traz "Edital nº /2026" em branco</w:t>
+            </w:r>
+          </w:p>
+        </w:tc>
+        <w:tc>
+          <w:tcPr>
+            <w:tcW w:type="dxa" w:w="1973"/>
+          </w:tcPr>
+          <w:p>
+            <w:pPr>
+              <w:spacing w:after="0"/>
+            </w:pPr>
+            <w:r>
+              <w:rPr>
+                <w:sz w:val="18"/>
+              </w:rPr>
+              <w:t>Anexo II</w:t>
+            </w:r>
+          </w:p>
+        </w:tc>
+        <w:tc>
+          <w:tcPr>
+            <w:tcW w:type="dxa" w:w="1973"/>
+          </w:tcPr>
+          <w:p>
+            <w:pPr>
+              <w:spacing w:after="0"/>
+            </w:pPr>
+            <w:r>
+              <w:rPr>
+                <w:sz w:val="18"/>
+              </w:rPr>
+              <w:t>Preencher "Edital SCEIC FSA nº 10/2026"</w:t>
+            </w:r>
+          </w:p>
+        </w:tc>
+        <w:tc>
+          <w:tcPr>
+            <w:tcW w:type="dxa" w:w="1973"/>
+          </w:tcPr>
+          <w:p>
+            <w:pPr>
+              <w:spacing w:after="0"/>
+            </w:pPr>
+            <w:r>
+              <w:rPr>
+                <w:sz w:val="18"/>
+              </w:rPr>
+              <w:t>Não é necessária</w:t>
+            </w:r>
+          </w:p>
+        </w:tc>
+      </w:tr>
+      <w:tr>
+        <w:tc>
+          <w:tcPr>
+            <w:tcW w:type="dxa" w:w="1973"/>
+          </w:tcPr>
+          <w:p>
+            <w:pPr>
+              <w:spacing w:after="0"/>
+            </w:pPr>
+            <w:r>
+              <w:rPr>
+                <w:sz w:val="18"/>
+              </w:rPr>
+              <w:t>D11</w:t>
+            </w:r>
+          </w:p>
+        </w:tc>
+        <w:tc>
+          <w:tcPr>
+            <w:tcW w:type="dxa" w:w="1973"/>
+          </w:tcPr>
+          <w:p>
+            <w:pPr>
+              <w:spacing w:after="0"/>
+            </w:pPr>
+            <w:r>
+              <w:rPr>
+                <w:sz w:val="18"/>
+              </w:rPr>
+              <w:t>O edital cita o Anexo III como "lista de cidades", mas o item 2.1 p diz que a relação está "disponível no sistema"</w:t>
+            </w:r>
+          </w:p>
+        </w:tc>
+        <w:tc>
+          <w:tcPr>
+            <w:tcW w:type="dxa" w:w="1973"/>
+          </w:tcPr>
+          <w:p>
+            <w:pPr>
+              <w:spacing w:after="0"/>
+            </w:pPr>
+            <w:r>
+              <w:rPr>
+                <w:sz w:val="18"/>
+              </w:rPr>
+              <w:t>2.1 p e 18.11</w:t>
+            </w:r>
+          </w:p>
+        </w:tc>
+        <w:tc>
+          <w:tcPr>
+            <w:tcW w:type="dxa" w:w="1973"/>
+          </w:tcPr>
+          <w:p>
+            <w:pPr>
+              <w:spacing w:after="0"/>
+            </w:pPr>
+            <w:r>
+              <w:rPr>
+                <w:sz w:val="18"/>
+              </w:rPr>
+              <w:t>A lista pode estar só dentro do sistema de inscrição, e não em PDF</w:t>
+            </w:r>
+          </w:p>
+        </w:tc>
+        <w:tc>
+          <w:tcPr>
+            <w:tcW w:type="dxa" w:w="1973"/>
+          </w:tcPr>
+          <w:p>
+            <w:pPr>
+              <w:spacing w:after="0"/>
+            </w:pPr>
+            <w:r>
+              <w:rPr>
+                <w:sz w:val="18"/>
+              </w:rPr>
+              <w:t>Onde consultar a relação de municípios da Film Commission?</w:t>
             </w:r>
           </w:p>
         </w:tc>
@@ -15258,7 +17066,7 @@
               <w:rPr>
                 <w:sz w:val="18"/>
               </w:rPr>
-              <w:t>Baixar os Anexos I a IX em www.fomento.sp.gov.br e completar as partes marcadas "a completar com o anexo"</w:t>
+              <w:t>Baixar os anexos que faltam (III, IV, VI, VII, VIII e IX) em www.fomento.sp.gov.br. Se o Anexo III não existir como arquivo, procurar a lista de cidades dentro do sistema de inscrição</w:t>
             </w:r>
           </w:p>
         </w:tc>
@@ -15378,6 +17186,74 @@
               <w:rPr>
                 <w:sz w:val="18"/>
               </w:rPr>
+              <w:t>Esta semana</w:t>
+            </w:r>
+          </w:p>
+        </w:tc>
+        <w:tc>
+          <w:tcPr>
+            <w:tcW w:type="dxa" w:w="4933"/>
+          </w:tcPr>
+          <w:p>
+            <w:pPr>
+              <w:spacing w:after="0"/>
+            </w:pPr>
+            <w:r>
+              <w:rPr>
+                <w:sz w:val="18"/>
+              </w:rPr>
+              <w:t>Verificar se o projeto já está aprovado para captação na ANCINE. Se não estiver, preparar o pedido para fazer logo depois do resultado</w:t>
+            </w:r>
+          </w:p>
+        </w:tc>
+      </w:tr>
+      <w:tr>
+        <w:tc>
+          <w:tcPr>
+            <w:tcW w:type="dxa" w:w="4933"/>
+          </w:tcPr>
+          <w:p>
+            <w:pPr>
+              <w:spacing w:after="0"/>
+            </w:pPr>
+            <w:r>
+              <w:rPr>
+                <w:sz w:val="18"/>
+              </w:rPr>
+              <w:t>Em seguida</w:t>
+            </w:r>
+          </w:p>
+        </w:tc>
+        <w:tc>
+          <w:tcPr>
+            <w:tcW w:type="dxa" w:w="4933"/>
+          </w:tcPr>
+          <w:p>
+            <w:pPr>
+              <w:spacing w:after="0"/>
+            </w:pPr>
+            <w:r>
+              <w:rPr>
+                <w:sz w:val="18"/>
+              </w:rPr>
+              <w:t>Fechar a distribuidora (cinema) ou o canal de TV (TV e streaming) e conferir se eles estão em dia com a ANCINE e com as certidões</w:t>
+            </w:r>
+          </w:p>
+        </w:tc>
+      </w:tr>
+      <w:tr>
+        <w:tc>
+          <w:tcPr>
+            <w:tcW w:type="dxa" w:w="4933"/>
+          </w:tcPr>
+          <w:p>
+            <w:pPr>
+              <w:spacing w:after="0"/>
+            </w:pPr>
+            <w:r>
+              <w:rPr>
+                <w:sz w:val="18"/>
+              </w:rPr>
               <w:t>Até 30/10</w:t>
             </w:r>
           </w:p>
@@ -15394,7 +17270,7 @@
               <w:rPr>
                 <w:sz w:val="18"/>
               </w:rPr>
-              <w:t>Enviar ao canal oficial as perguntas D1, D2, D3, D5, D6 e D7</w:t>
+              <w:t>Enviar ao canal oficial as perguntas D1, D2, D3, D5, D6, D7 e D11</w:t>
             </w:r>
           </w:p>
         </w:tc>

</xml_diff>